<commit_message>
Add POM coverage scenarios and update test documentation
</commit_message>
<xml_diff>
--- a/TestPlan_DemoWebShop_v2.docx
+++ b/TestPlan_DemoWebShop_v2.docx
@@ -29096,6 +29096,73 @@
       </w:r>
     </w:p>
     <w:p>
+      <w:p>
+        <w:pPr>
+          <w:spacing w:after="120" w:before="0"/>
+        </w:pPr>
+        <w:r>
+          <w:rPr>
+            <w:rFonts w:ascii="Arial" w:cs="Arial" w:eastAsia="Arial" w:hAnsi="Arial"/>
+            <w:b/>
+            <w:bCs/>
+            <w:sz w:val="28"/>
+            <w:szCs w:val="28"/>
+          </w:rPr>
+          <w:t xml:space="preserve">Latest Automation Coverage Updates</w:t>
+        </w:r>
+      </w:p>
+      <w:p>
+        <w:pPr>
+          <w:spacing w:after="120" w:before="0"/>
+        </w:pPr>
+        <w:r>
+          <w:rPr>
+            <w:rFonts w:ascii="Arial" w:cs="Arial" w:eastAsia="Arial" w:hAnsi="Arial"/>
+            <w:sz w:val="20"/>
+            <w:szCs w:val="20"/>
+          </w:rPr>
+          <w:t xml:space="preserve">Coverage now tracks positive, negative, boundary, and edge-case scenarios across Registration, Login/Logout, Homepage Navigation, Search, Cart, Wishlist, Checkout, and Accessibility.</w:t>
+        </w:r>
+      </w:p>
+      <w:p>
+        <w:pPr>
+          <w:spacing w:after="120" w:before="0"/>
+        </w:pPr>
+        <w:r>
+          <w:rPr>
+            <w:rFonts w:ascii="Arial" w:cs="Arial" w:eastAsia="Arial" w:hAnsi="Arial"/>
+            <w:sz w:val="20"/>
+            <w:szCs w:val="20"/>
+          </w:rPr>
+          <w:t xml:space="preserve">Added ProductPage to keep product detail actions such as Add to cart and Add to wishlist inside the POM framework.</w:t>
+        </w:r>
+      </w:p>
+      <w:p>
+        <w:pPr>
+          <w:spacing w:after="120" w:before="0"/>
+        </w:pPr>
+        <w:r>
+          <w:rPr>
+            <w:rFonts w:ascii="Arial" w:cs="Arial" w:eastAsia="Arial" w:hAnsi="Arial"/>
+            <w:sz w:val="20"/>
+            <w:szCs w:val="20"/>
+          </w:rPr>
+          <w:t xml:space="preserve">Added boundary and negative scenarios: TC-REG-07 minimum valid password length, TC-CART-09 quantity zero removes item, TC-WISH-06 empty wishlist message, and TC-CHK-09 checkout blocked when terms are not accepted.</w:t>
+        </w:r>
+      </w:p>
+      <w:p>
+        <w:pPr>
+          <w:spacing w:after="120" w:before="0"/>
+        </w:pPr>
+        <w:r>
+          <w:rPr>
+            <w:rFonts w:ascii="Arial" w:cs="Arial" w:eastAsia="Arial" w:hAnsi="Arial"/>
+            <w:sz w:val="20"/>
+            <w:szCs w:val="20"/>
+          </w:rPr>
+          <w:t xml:space="preserve">Updated supporting documentation: README.md, TEST_COVERAGE.md, and Automation Test Case Mapping Table.txt.</w:t>
+        </w:r>
+      </w:p>
       <w:pPr>
         <w:spacing w:after="60" w:before="60"/>
       </w:pPr>

</xml_diff>